<commit_message>
docs: team members in the proposal; deploy steps for restoring the real database
Co-Authored-By: Claude Opus 5.5 <noreply@anthropic.com>
Claude-Session: https://claude.ai/code/session_011abBRk8wkucCirDCsJVqK9
</commit_message>
<xml_diff>
--- a/docs/PROJECT_PROPOSAL.docx
+++ b/docs/PROJECT_PROPOSAL.docx
@@ -561,8 +561,7 @@
     <w:tbl>
       <w:tblPr>
         <w:tblStyle w:val="Table"/>
-        <w:tblW w:type="pct" w:w="5000"/>
-        <w:tblLayout w:type="fixed"/>
+        <w:tblW w:type="auto" w:w="0"/>
         <w:tblLook w:firstRow="1" w:lastRow="0" w:firstColumn="0" w:lastColumn="0" w:noHBand="0" w:noVBand="0" w:val="0020"/>
       </w:tblPr>
       <w:tblGrid>
@@ -654,30 +653,18 @@
               <w:pStyle w:val="Compact"/>
             </w:pPr>
             <w:r>
-              <w:rPr>
-                <w:rStyle w:val="VerbatimChar"/>
-              </w:rPr>
-              <w:t xml:space="preserve">&lt;Partner full name&gt;</w:t>
-            </w:r>
-            <w:r>
-              <w:t xml:space="preserve"> </w:t>
-            </w:r>
-            <w:r>
-              <w:t xml:space="preserve">(GitHub: shalom17san-Storm)</w:t>
-            </w:r>
-          </w:p>
-        </w:tc>
-        <w:tc>
-          <w:tcPr/>
-          <w:p>
-            <w:pPr>
-              <w:pStyle w:val="Compact"/>
-            </w:pPr>
-            <w:r>
-              <w:rPr>
-                <w:rStyle w:val="VerbatimChar"/>
-              </w:rPr>
-              <w:t xml:space="preserve">&lt;Partner register number&gt;</w:t>
+              <w:t xml:space="preserve">Shalom Santosh</w:t>
+            </w:r>
+          </w:p>
+        </w:tc>
+        <w:tc>
+          <w:tcPr/>
+          <w:p>
+            <w:pPr>
+              <w:pStyle w:val="Compact"/>
+            </w:pPr>
+            <w:r>
+              <w:t xml:space="preserve">24BCE2731</w:t>
             </w:r>
           </w:p>
         </w:tc>

</xml_diff>

<commit_message>
docs: live URL in the proposal
Co-Authored-By: Claude Opus 5.5 <noreply@anthropic.com>
Claude-Session: https://claude.ai/code/session_011abBRk8wkucCirDCsJVqK9
</commit_message>
<xml_diff>
--- a/docs/PROJECT_PROPOSAL.docx
+++ b/docs/PROJECT_PROPOSAL.docx
@@ -10,7 +10,7 @@
         <w:t xml:space="preserve">FrameCheck: Project Proposal</w:t>
       </w:r>
     </w:p>
-    <w:bookmarkStart w:id="35" w:name="framecheck-project-proposal"/>
+    <w:bookmarkStart w:id="36" w:name="framecheck-project-proposal"/>
     <w:p>
       <w:pPr>
         <w:pStyle w:val="Heading1"/>
@@ -926,7 +926,7 @@
       </w:tr>
     </w:tbl>
     <w:bookmarkEnd w:id="14"/>
-    <w:bookmarkStart w:id="30" w:name="major-deliverables"/>
+    <w:bookmarkStart w:id="31" w:name="major-deliverables"/>
     <w:p>
       <w:pPr>
         <w:pStyle w:val="Heading2"/>
@@ -1432,18 +1432,26 @@
             <w:pPr>
               <w:pStyle w:val="Compact"/>
             </w:pPr>
-            <w:r>
-              <w:rPr>
-                <w:rStyle w:val="VerbatimChar"/>
-              </w:rPr>
-              <w:t xml:space="preserve">&lt;added once deployed&gt;</w:t>
+            <w:hyperlink r:id="rId30">
+              <w:r>
+                <w:rPr>
+                  <w:rStyle w:val="Hyperlink"/>
+                </w:rPr>
+                <w:t xml:space="preserve">https://framecheck-awlf.onrender.com</w:t>
+              </w:r>
+            </w:hyperlink>
+            <w:r>
+              <w:t xml:space="preserve"> </w:t>
+            </w:r>
+            <w:r>
+              <w:t xml:space="preserve">(sign-in required)</w:t>
             </w:r>
           </w:p>
         </w:tc>
       </w:tr>
     </w:tbl>
-    <w:bookmarkEnd w:id="30"/>
-    <w:bookmarkStart w:id="34" w:name="gantt-chart"/>
+    <w:bookmarkEnd w:id="31"/>
+    <w:bookmarkStart w:id="35" w:name="gantt-chart"/>
     <w:p>
       <w:pPr>
         <w:pStyle w:val="Heading2"/>
@@ -1493,18 +1501,18 @@
           <wp:inline>
             <wp:extent cx="5334000" cy="1957855"/>
             <wp:effectExtent b="0" l="0" r="0" t="0"/>
-            <wp:docPr descr="Gantt chart" title="" id="32" name="Picture"/>
+            <wp:docPr descr="Gantt chart" title="" id="33" name="Picture"/>
             <a:graphic>
               <a:graphicData uri="http://schemas.openxmlformats.org/drawingml/2006/picture">
                 <pic:pic>
                   <pic:nvPicPr>
-                    <pic:cNvPr descr="gantt.png" id="33" name="Picture"/>
+                    <pic:cNvPr descr="gantt.png" id="34" name="Picture"/>
                     <pic:cNvPicPr>
                       <a:picLocks noChangeArrowheads="1" noChangeAspect="1"/>
                     </pic:cNvPicPr>
                   </pic:nvPicPr>
                   <pic:blipFill>
-                    <a:blip r:embed="rId31"/>
+                    <a:blip r:embed="rId32"/>
                     <a:stretch>
                       <a:fillRect/>
                     </a:stretch>
@@ -1539,8 +1547,8 @@
         <w:t xml:space="preserve">Gantt chart</w:t>
       </w:r>
     </w:p>
-    <w:bookmarkEnd w:id="34"/>
     <w:bookmarkEnd w:id="35"/>
+    <w:bookmarkEnd w:id="36"/>
     <w:sectPr>
       <w:footnotePr>
         <w:numRestart w:val="eachSect"/>

</xml_diff>